<commit_message>
Tighten the juvenile records request the way the other two were
The same treatment the concurrent jurisdiction application got: the caption
sits directly under "STATE OF OKLAHOMA", one blank line separates it from the
title and the title from the body, and the three blocks somebody signs — the
attorney's on the application, the judge's on the order, and the attorney's
again beneath it — are single spaced with no space after.

Seventeen blank paragraphs went, including the run of seven that was holding
the page break at the foot of the application. One line of air was put back
above "By:", which the office's markup asked for and which the single spacing
would otherwise have swallowed.

Co-Authored-By: Claude Opus 5 <noreply@anthropic.com>
</commit_message>
<xml_diff>
--- a/templates/dhs/dhs_juvenile_records.docx
+++ b/templates/dhs/dhs_juvenile_records.docx
@@ -28,31 +28,6 @@
           <w:b/>
         </w:rPr>
         <w:t xml:space="preserve">STATE OF OKLAHOMA</w:t>
-      </w:r>
-    </w:p>
-    <w:p>
-      <w:pPr>
-        <w:jc w:val="center"/>
-      </w:pPr>
-      <w:r>
-        <w:rPr>
-          <w:rFonts w:ascii="Times New Roman" w:hAnsi="Times New Roman" w:cs="Times New Roman"/>
-          <w:sz w:val="24"/>
-          <w:szCs w:val="24"/>
-          <w:b/>
-        </w:rPr>
-        <w:t xml:space="preserve"/>
-      </w:r>
-    </w:p>
-    <w:p>
-      <w:pPr/>
-      <w:r>
-        <w:rPr>
-          <w:rFonts w:ascii="Times New Roman" w:hAnsi="Times New Roman" w:cs="Times New Roman"/>
-          <w:sz w:val="24"/>
-          <w:szCs w:val="24"/>
-        </w:rPr>
-        <w:t xml:space="preserve"/>
       </w:r>
     </w:p>
     <w:tbl>
@@ -556,39 +531,6 @@
       </w:r>
     </w:p>
     <w:p>
-      <w:pPr/>
-      <w:r>
-        <w:rPr>
-          <w:rFonts w:ascii="Times New Roman" w:hAnsi="Times New Roman" w:cs="Times New Roman"/>
-          <w:sz w:val="24"/>
-          <w:szCs w:val="24"/>
-        </w:rPr>
-        <w:t xml:space="preserve"/>
-      </w:r>
-    </w:p>
-    <w:p>
-      <w:pPr/>
-      <w:r>
-        <w:rPr>
-          <w:rFonts w:ascii="Times New Roman" w:hAnsi="Times New Roman" w:cs="Times New Roman"/>
-          <w:sz w:val="24"/>
-          <w:szCs w:val="24"/>
-        </w:rPr>
-        <w:t xml:space="preserve"/>
-      </w:r>
-    </w:p>
-    <w:p>
-      <w:pPr/>
-      <w:r>
-        <w:rPr>
-          <w:rFonts w:ascii="Times New Roman" w:hAnsi="Times New Roman" w:cs="Times New Roman"/>
-          <w:sz w:val="24"/>
-          <w:szCs w:val="24"/>
-        </w:rPr>
-        <w:t xml:space="preserve"/>
-      </w:r>
-    </w:p>
-    <w:p>
       <w:pPr>
         <w:jc w:val="center"/>
       </w:pPr>
@@ -618,17 +560,6 @@
       </w:r>
     </w:p>
     <w:p>
-      <w:pPr/>
-      <w:r>
-        <w:rPr>
-          <w:rFonts w:ascii="Times New Roman" w:hAnsi="Times New Roman" w:cs="Times New Roman"/>
-          <w:sz w:val="24"/>
-          <w:szCs w:val="24"/>
-        </w:rPr>
-        <w:t xml:space="preserve"/>
-      </w:r>
-    </w:p>
-    <w:p>
       <w:pPr>
         <w:jc w:val="both"/>
         <w:ind w:firstLine="1440"/>
@@ -681,6 +612,12 @@
     </w:p>
     <w:p>
       <w:pPr>
+        <w:jc w:val="both"/>
+      </w:pPr>
+    </w:p>
+    <w:p>
+      <w:pPr>
+        <w:spacing w:after="0" w:line="240" w:lineRule="auto"/>
         <w:ind w:left="4320"/>
         <w:jc w:val="both"/>
       </w:pPr>
@@ -689,7 +626,6 @@
           <w:rFonts w:ascii="Times New Roman" w:hAnsi="Times New Roman" w:cs="Times New Roman"/>
           <w:sz w:val="24"/>
           <w:szCs w:val="24"/>
-          <w:spacing w:val="-2"/>
         </w:rPr>
         <w:t xml:space="preserve"/>
       </w:r>
@@ -704,6 +640,7 @@
     </w:p>
     <w:p>
       <w:pPr>
+        <w:spacing w:after="0" w:line="240" w:lineRule="auto"/>
         <w:ind w:left="4320"/>
       </w:pPr>
       <w:r>
@@ -717,6 +654,7 @@
     </w:p>
     <w:p>
       <w:pPr>
+        <w:spacing w:after="0" w:line="240" w:lineRule="auto"/>
         <w:ind w:left="4320"/>
       </w:pPr>
       <w:r>
@@ -730,6 +668,7 @@
     </w:p>
     <w:p>
       <w:pPr>
+        <w:spacing w:after="0" w:line="240" w:lineRule="auto"/>
         <w:ind w:left="4320"/>
       </w:pPr>
       <w:r>
@@ -743,6 +682,7 @@
     </w:p>
     <w:p>
       <w:pPr>
+        <w:spacing w:after="0" w:line="240" w:lineRule="auto"/>
         <w:ind w:left="4320"/>
       </w:pPr>
       <w:r>
@@ -756,6 +696,7 @@
     </w:p>
     <w:p>
       <w:pPr>
+        <w:spacing w:after="0" w:line="240" w:lineRule="auto"/>
         <w:ind w:left="4320"/>
         <w:jc w:val="both"/>
       </w:pPr>
@@ -770,6 +711,7 @@
     </w:p>
     <w:p>
       <w:pPr>
+        <w:spacing w:after="0" w:line="240" w:lineRule="auto"/>
         <w:ind w:left="4320"/>
         <w:jc w:val="both"/>
       </w:pPr>
@@ -792,85 +734,6 @@
     </w:p>
     <w:p>
       <w:pPr>
-        <w:jc w:val="both"/>
-      </w:pPr>
-      <w:r>
-        <w:rPr>
-          <w:rFonts w:ascii="Times New Roman" w:hAnsi="Times New Roman" w:cs="Times New Roman"/>
-          <w:sz w:val="24"/>
-          <w:szCs w:val="24"/>
-        </w:rPr>
-        <w:t xml:space="preserve"/>
-      </w:r>
-    </w:p>
-    <w:p>
-      <w:pPr>
-        <w:jc w:val="both"/>
-      </w:pPr>
-      <w:r>
-        <w:rPr>
-          <w:rFonts w:ascii="Times New Roman" w:hAnsi="Times New Roman" w:cs="Times New Roman"/>
-          <w:sz w:val="24"/>
-          <w:szCs w:val="24"/>
-        </w:rPr>
-        <w:t xml:space="preserve"/>
-      </w:r>
-    </w:p>
-    <w:p>
-      <w:pPr>
-        <w:jc w:val="both"/>
-      </w:pPr>
-      <w:r>
-        <w:rPr>
-          <w:rFonts w:ascii="Times New Roman" w:hAnsi="Times New Roman" w:cs="Times New Roman"/>
-          <w:sz w:val="24"/>
-          <w:szCs w:val="24"/>
-        </w:rPr>
-        <w:t xml:space="preserve"/>
-      </w:r>
-    </w:p>
-    <w:p>
-      <w:pPr>
-        <w:jc w:val="both"/>
-      </w:pPr>
-      <w:r>
-        <w:rPr>
-          <w:rFonts w:ascii="Times New Roman" w:hAnsi="Times New Roman" w:cs="Times New Roman"/>
-          <w:sz w:val="24"/>
-          <w:szCs w:val="24"/>
-        </w:rPr>
-        <w:t xml:space="preserve"/>
-      </w:r>
-    </w:p>
-    <w:p>
-      <w:pPr>
-        <w:jc w:val="both"/>
-      </w:pPr>
-      <w:r>
-        <w:rPr>
-          <w:rFonts w:ascii="Times New Roman" w:hAnsi="Times New Roman" w:cs="Times New Roman"/>
-          <w:sz w:val="24"/>
-          <w:szCs w:val="24"/>
-        </w:rPr>
-        <w:t xml:space="preserve"/>
-      </w:r>
-    </w:p>
-    <w:p>
-      <w:pPr>
-        <w:jc w:val="both"/>
-      </w:pPr>
-      <w:r>
-        <w:rPr>
-          <w:rFonts w:ascii="Times New Roman" w:hAnsi="Times New Roman" w:cs="Times New Roman"/>
-          <w:sz w:val="24"/>
-          <w:szCs w:val="24"/>
-          <w:spacing w:val="-2"/>
-        </w:rPr>
-        <w:t xml:space="preserve"/>
-      </w:r>
-    </w:p>
-    <w:p>
-      <w:pPr>
         <w:spacing w:after="0" w:line="240" w:lineRule="auto"/>
       </w:pPr>
       <w:r>
@@ -908,31 +771,6 @@
           <w:b/>
         </w:rPr>
         <w:t xml:space="preserve">STATE OF OKLAHOMA</w:t>
-      </w:r>
-    </w:p>
-    <w:p>
-      <w:pPr>
-        <w:jc w:val="center"/>
-      </w:pPr>
-      <w:r>
-        <w:rPr>
-          <w:rFonts w:ascii="Times New Roman" w:hAnsi="Times New Roman" w:cs="Times New Roman"/>
-          <w:sz w:val="24"/>
-          <w:szCs w:val="24"/>
-          <w:b/>
-        </w:rPr>
-        <w:t xml:space="preserve"/>
-      </w:r>
-    </w:p>
-    <w:p>
-      <w:pPr/>
-      <w:r>
-        <w:rPr>
-          <w:rFonts w:ascii="Times New Roman" w:hAnsi="Times New Roman" w:cs="Times New Roman"/>
-          <w:sz w:val="24"/>
-          <w:szCs w:val="24"/>
-        </w:rPr>
-        <w:t xml:space="preserve"/>
       </w:r>
     </w:p>
     <w:tbl>
@@ -1436,28 +1274,6 @@
       </w:r>
     </w:p>
     <w:p>
-      <w:pPr/>
-      <w:r>
-        <w:rPr>
-          <w:rFonts w:ascii="Times New Roman" w:hAnsi="Times New Roman" w:cs="Times New Roman"/>
-          <w:sz w:val="24"/>
-          <w:szCs w:val="24"/>
-        </w:rPr>
-        <w:t xml:space="preserve"/>
-      </w:r>
-    </w:p>
-    <w:p>
-      <w:pPr/>
-      <w:r>
-        <w:rPr>
-          <w:rFonts w:ascii="Times New Roman" w:hAnsi="Times New Roman" w:cs="Times New Roman"/>
-          <w:sz w:val="24"/>
-          <w:szCs w:val="24"/>
-        </w:rPr>
-        <w:t xml:space="preserve"/>
-      </w:r>
-    </w:p>
-    <w:p>
       <w:pPr>
         <w:jc w:val="center"/>
       </w:pPr>
@@ -1489,21 +1305,6 @@
     </w:p>
     <w:p>
       <w:pPr>
-        <w:jc w:val="center"/>
-      </w:pPr>
-      <w:r>
-        <w:rPr>
-          <w:rFonts w:ascii="Times New Roman" w:hAnsi="Times New Roman" w:cs="Times New Roman"/>
-          <w:sz w:val="24"/>
-          <w:szCs w:val="24"/>
-          <w:b/>
-          <w:u w:val="single"/>
-        </w:rPr>
-        <w:t xml:space="preserve"/>
-      </w:r>
-    </w:p>
-    <w:p>
-      <w:pPr>
         <w:jc w:val="both"/>
         <w:ind w:firstLine="720"/>
       </w:pPr>
@@ -1639,6 +1440,7 @@
     </w:p>
     <w:p>
       <w:pPr>
+        <w:spacing w:after="0" w:line="240" w:lineRule="auto"/>
         <w:ind w:left="4320"/>
       </w:pPr>
       <w:r>
@@ -1661,6 +1463,7 @@
     </w:p>
     <w:p>
       <w:pPr>
+        <w:spacing w:after="0" w:line="240" w:lineRule="auto"/>
         <w:ind w:left="4320"/>
       </w:pPr>
       <w:r>
@@ -1697,7 +1500,9 @@
       </w:r>
     </w:p>
     <w:p>
-      <w:pPr/>
+      <w:pPr>
+        <w:spacing w:after="0" w:line="240" w:lineRule="auto"/>
+      </w:pPr>
       <w:r>
         <w:rPr>
           <w:rFonts w:ascii="Times New Roman" w:hAnsi="Times New Roman" w:cs="Times New Roman"/>
@@ -1710,7 +1515,9 @@
       </w:r>
     </w:p>
     <w:p>
-      <w:pPr/>
+      <w:pPr>
+        <w:spacing w:after="0" w:line="240" w:lineRule="auto"/>
+      </w:pPr>
       <w:r>
         <w:rPr>
           <w:rFonts w:ascii="Times New Roman" w:hAnsi="Times New Roman" w:cs="Times New Roman"/>
@@ -1721,7 +1528,9 @@
       </w:r>
     </w:p>
     <w:p>
-      <w:pPr/>
+      <w:pPr>
+        <w:spacing w:after="0" w:line="240" w:lineRule="auto"/>
+      </w:pPr>
       <w:r>
         <w:rPr>
           <w:rFonts w:ascii="Times New Roman" w:hAnsi="Times New Roman" w:cs="Times New Roman"/>
@@ -1732,7 +1541,9 @@
       </w:r>
     </w:p>
     <w:p>
-      <w:pPr/>
+      <w:pPr>
+        <w:spacing w:after="0" w:line="240" w:lineRule="auto"/>
+      </w:pPr>
       <w:r>
         <w:rPr>
           <w:rFonts w:ascii="Times New Roman" w:hAnsi="Times New Roman" w:cs="Times New Roman"/>
@@ -1743,7 +1554,9 @@
       </w:r>
     </w:p>
     <w:p>
-      <w:pPr/>
+      <w:pPr>
+        <w:spacing w:after="0" w:line="240" w:lineRule="auto"/>
+      </w:pPr>
       <w:r>
         <w:rPr>
           <w:rFonts w:ascii="Times New Roman" w:hAnsi="Times New Roman" w:cs="Times New Roman"/>

</xml_diff>